<commit_message>
modified (docs : Taller_U2_TurnoFacil_Cesar)
</commit_message>
<xml_diff>
--- a/Taller_U2_TurnoFacil_Cesar.docx
+++ b/Taller_U2_TurnoFacil_Cesar.docx
@@ -625,9 +625,12 @@
     </w:p>
     <w:p>
       <w:pPr>
-        <w:shd w:val="clear" w:color="auto" w:fill="F1F5F9"/>
-        <w:spacing w:after="80"/>
-      </w:pPr>
+        <w:pBdr>
+          <w:bottom w:val="single" w:sz="4" w:space="1" w:color="CBD5E1"/>
+        </w:pBdr>
+        <w:spacing w:before="160" w:after="160"/>
+      </w:pPr>
+      <w:proofErr w:type="gramStart"/>
       <w:r>
         <w:rPr>
           <w:rFonts w:ascii="Courier New" w:eastAsia="Courier New" w:hAnsi="Courier New" w:cs="Courier New"/>
@@ -635,16 +638,20 @@
           <w:sz w:val="18"/>
           <w:szCs w:val="18"/>
         </w:rPr>
-        <w:t>https://github.com/[usuario]/turnofacil</w:t>
-      </w:r>
-    </w:p>
-    <w:p>
-      <w:pPr>
-        <w:pBdr>
-          <w:bottom w:val="single" w:sz="4" w:space="1" w:color="CBD5E1"/>
-        </w:pBdr>
-        <w:spacing w:before="160" w:after="160"/>
-      </w:pPr>
+        <w:t>git@github.com:Cesar12815/</w:t>
+      </w:r>
+      <w:proofErr w:type="spellStart"/>
+      <w:r>
+        <w:rPr>
+          <w:rFonts w:ascii="Courier New" w:eastAsia="Courier New" w:hAnsi="Courier New" w:cs="Courier New"/>
+          <w:color w:val="1D4ED8"/>
+          <w:sz w:val="18"/>
+          <w:szCs w:val="18"/>
+        </w:rPr>
+        <w:t>TurnoFacil.git</w:t>
+      </w:r>
+      <w:proofErr w:type="spellEnd"/>
+      <w:proofErr w:type="gramEnd"/>
     </w:p>
     <w:p>
       <w:pPr>
@@ -810,7 +817,6 @@
         <w:spacing w:after="80"/>
       </w:pPr>
       <w:r>
-        <w:lastRenderedPageBreak/>
         <w:t>Asesoría Académica — 15 cupos</w:t>
       </w:r>
     </w:p>
@@ -824,6 +830,7 @@
         <w:spacing w:after="80"/>
       </w:pPr>
       <w:r>
+        <w:lastRenderedPageBreak/>
         <w:t>Certificados — 20 cupos</w:t>
       </w:r>
     </w:p>
@@ -939,7 +946,6 @@
         <w:jc w:val="both"/>
       </w:pPr>
       <w:r>
-        <w:lastRenderedPageBreak/>
         <w:drawing>
           <wp:inline distT="0" distB="0" distL="0" distR="0" wp14:anchorId="26625A32" wp14:editId="734F64C0">
             <wp:extent cx="6301740" cy="5166360"/>
@@ -998,6 +1004,7 @@
         <w:rPr>
           <w:color w:val="64748B"/>
         </w:rPr>
+        <w:lastRenderedPageBreak/>
         <w:t>[Captura: Pantalla de detalle con cupos = 0 y botón bloqueado]</w:t>
       </w:r>
     </w:p>
@@ -1088,22 +1095,22 @@
         <w:rPr>
           <w:color w:val="64748B"/>
         </w:rPr>
+        <w:t>[Captura: Formulario de solicitud de turno]</w:t>
+      </w:r>
+    </w:p>
+    <w:p>
+      <w:pPr>
+        <w:spacing w:after="140"/>
+        <w:jc w:val="both"/>
+      </w:pPr>
+    </w:p>
+    <w:p>
+      <w:pPr>
+        <w:spacing w:after="140"/>
+        <w:jc w:val="both"/>
+      </w:pPr>
+      <w:r>
         <w:lastRenderedPageBreak/>
-        <w:t>[Captura: Formulario de solicitud de turno]</w:t>
-      </w:r>
-    </w:p>
-    <w:p>
-      <w:pPr>
-        <w:spacing w:after="140"/>
-        <w:jc w:val="both"/>
-      </w:pPr>
-    </w:p>
-    <w:p>
-      <w:pPr>
-        <w:spacing w:after="140"/>
-        <w:jc w:val="both"/>
-      </w:pPr>
-      <w:r>
         <w:drawing>
           <wp:inline distT="0" distB="0" distL="0" distR="0" wp14:anchorId="32610DB2" wp14:editId="4B176784">
             <wp:extent cx="6233160" cy="5196840"/>
@@ -2288,18 +2295,46 @@
     </w:p>
     <w:p>
       <w:pPr>
-        <w:shd w:val="clear" w:color="auto" w:fill="F1F5F9"/>
-        <w:spacing w:after="80"/>
-      </w:pPr>
-      <w:r>
+        <w:pBdr>
+          <w:bottom w:val="single" w:sz="4" w:space="1" w:color="CBD5E1"/>
+        </w:pBdr>
+        <w:spacing w:before="160" w:after="160"/>
         <w:rPr>
           <w:rFonts w:ascii="Courier New" w:eastAsia="Courier New" w:hAnsi="Courier New" w:cs="Courier New"/>
           <w:color w:val="1D4ED8"/>
           <w:sz w:val="18"/>
           <w:szCs w:val="18"/>
         </w:rPr>
-        <w:t>https://github.com/[usuario]/turnofacil-backend</w:t>
-      </w:r>
+      </w:pPr>
+      <w:hyperlink r:id="rId14" w:history="1">
+        <w:r>
+          <w:rPr>
+            <w:rStyle w:val="Hipervnculo"/>
+            <w:rFonts w:ascii="Courier New" w:eastAsia="Courier New" w:hAnsi="Courier New" w:cs="Courier New"/>
+            <w:sz w:val="18"/>
+            <w:szCs w:val="18"/>
+          </w:rPr>
+          <w:t>https://github.com/Cesar12815/T</w:t>
+        </w:r>
+        <w:r>
+          <w:rPr>
+            <w:rStyle w:val="Hipervnculo"/>
+            <w:rFonts w:ascii="Courier New" w:eastAsia="Courier New" w:hAnsi="Courier New" w:cs="Courier New"/>
+            <w:sz w:val="18"/>
+            <w:szCs w:val="18"/>
+          </w:rPr>
+          <w:t>u</w:t>
+        </w:r>
+        <w:r>
+          <w:rPr>
+            <w:rStyle w:val="Hipervnculo"/>
+            <w:rFonts w:ascii="Courier New" w:eastAsia="Courier New" w:hAnsi="Courier New" w:cs="Courier New"/>
+            <w:sz w:val="18"/>
+            <w:szCs w:val="18"/>
+          </w:rPr>
+          <w:t>rnoFacil/tree/main/turnofacil-backend</w:t>
+        </w:r>
+      </w:hyperlink>
     </w:p>
     <w:p>
       <w:pPr>
@@ -3178,6 +3213,30 @@
       <w:szCs w:val="20"/>
     </w:rPr>
   </w:style>
+  <w:style w:type="character" w:styleId="Mencinsinresolver">
+    <w:name w:val="Unresolved Mention"/>
+    <w:basedOn w:val="Fuentedeprrafopredeter"/>
+    <w:uiPriority w:val="99"/>
+    <w:semiHidden/>
+    <w:unhideWhenUsed/>
+    <w:rsid w:val="00686EA4"/>
+    <w:rPr>
+      <w:color w:val="605E5C"/>
+      <w:shd w:val="clear" w:color="auto" w:fill="E1DFDD"/>
+    </w:rPr>
+  </w:style>
+  <w:style w:type="character" w:styleId="Hipervnculovisitado">
+    <w:name w:val="FollowedHyperlink"/>
+    <w:basedOn w:val="Fuentedeprrafopredeter"/>
+    <w:uiPriority w:val="99"/>
+    <w:semiHidden/>
+    <w:unhideWhenUsed/>
+    <w:rsid w:val="00C84B3E"/>
+    <w:rPr>
+      <w:color w:val="96607D" w:themeColor="followedHyperlink"/>
+      <w:u w:val="single"/>
+    </w:rPr>
+  </w:style>
 </w:styles>
 </file>
 

</xml_diff>